<commit_message>
docs: verify pull workflow and finalize report
</commit_message>
<xml_diff>
--- a/实验1/report/实验一 软件工具的使用 实验报告.docx
+++ b/实验1/report/实验一 软件工具的使用 实验报告.docx
@@ -1111,7 +1111,7 @@
           <w:color w:val="000000"/>
           <w:sz w:val="21"/>
         </w:rPr>
-        <w:t>确认 Git 版本为 2.53.0 后，在 GitHub 建立公开仓库“软件工程实验”（网址标识为 software-engineering-labs）。项目按“实验1”分级保存，避免为后续实验重复建立仓库。本地克隆后补充 README、忽略规则以及签到系统和最小程序的目录。</w:t>
+        <w:t>确认 Git 版本为 2.53.0 后，在 GitHub 建立公开仓库“软件工程实验”（网址标识为 software-engineering-labs）。项目按“实验1”分级保存，避免为后续实验重复建立仓库。执行 git clone 时自动建立本地 .git 仓库，再补充 README、忽略规则以及签到系统和最小程序的目录。</w:t>
       </w:r>
     </w:p>
     <w:p>
@@ -1142,6 +1142,21 @@
           <w:sz w:val="18"/>
         </w:rPr>
         <w:t>git add .    →    git commit -m "feat: ..."    →    git push origin main</w:t>
+      </w:r>
+    </w:p>
+    <w:p>
+      <w:pPr>
+        <w:spacing w:after="80" w:line="276" w:lineRule="auto"/>
+        <w:ind w:left="283"/>
+      </w:pPr>
+      <w:r>
+        <w:rPr>
+          <w:rFonts w:ascii="Consolas" w:hAnsi="Consolas" w:eastAsia="Consolas"/>
+          <w:b w:val="0"/>
+          <w:color w:val="000000"/>
+          <w:sz w:val="18"/>
+        </w:rPr>
+        <w:t>git pull --ff-only origin main    →    Already up to date.</w:t>
       </w:r>
     </w:p>
     <w:p>
@@ -1962,7 +1977,7 @@
           <w:color w:val="000000"/>
           <w:sz w:val="21"/>
         </w:rPr>
-        <w:t>过程中我认识到，AI 生成的代码仍需通过运行和测试核对：时区数据库缺失、终端中文编码以及 Git 作者配置都需要根据实际环境排查。当前系统仅适合单机实验，没有身份认证和公网部署能力；若用于真实场景，还需补充权限控制、隐私保护和更完整的异常处理。</w:t>
+        <w:t>实验过程说明，AI 生成的代码仍需通过运行和测试核对：时区数据库缺失、终端中文编码以及 Git 作者配置都需要根据实际环境排查。当前系统仅适合单机实验，没有身份认证和公网部署能力；若用于真实场景，还需补充权限控制、隐私保护和更完整的异常处理。</w:t>
       </w:r>
     </w:p>
     <w:sectPr>

</xml_diff>

<commit_message>
docs: remove Word paragraph marker settings
</commit_message>
<xml_diff>
--- a/实验1/report/实验一 软件工具的使用 实验报告.docx
+++ b/实验1/report/实验一 软件工具的使用 实验报告.docx
@@ -606,7 +606,6 @@
     </w:p>
     <w:p>
       <w:pPr>
-        <w:keepNext w:val="0"/>
         <w:spacing w:before="0" w:after="160" w:line="307" w:lineRule="auto"/>
         <w:ind w:firstLine="397"/>
       </w:pPr>
@@ -623,7 +622,6 @@
     <w:p>
       <w:pPr>
         <w:pStyle w:val="Normal"/>
-        <w:keepNext/>
         <w:spacing w:before="260" w:after="120" w:line="276" w:lineRule="auto"/>
       </w:pPr>
       <w:r>
@@ -638,7 +636,6 @@
     </w:p>
     <w:p>
       <w:pPr>
-        <w:keepNext w:val="0"/>
         <w:spacing w:before="0" w:after="100" w:line="307" w:lineRule="auto"/>
         <w:ind w:firstLine="397"/>
       </w:pPr>
@@ -654,7 +651,6 @@
     </w:p>
     <w:p>
       <w:pPr>
-        <w:keepNext w:val="0"/>
         <w:spacing w:before="0" w:after="100" w:line="307" w:lineRule="auto"/>
         <w:ind w:firstLine="397"/>
       </w:pPr>
@@ -671,7 +667,6 @@
     <w:p>
       <w:pPr>
         <w:pStyle w:val="Normal"/>
-        <w:keepNext/>
         <w:spacing w:before="260" w:after="120" w:line="276" w:lineRule="auto"/>
       </w:pPr>
       <w:r>
@@ -1038,7 +1033,6 @@
     </w:tbl>
     <w:p>
       <w:pPr>
-        <w:keepNext w:val="0"/>
         <w:spacing w:before="0" w:after="0" w:line="307" w:lineRule="auto"/>
       </w:pPr>
       <w:r>
@@ -1052,7 +1046,6 @@
     </w:p>
     <w:p>
       <w:pPr>
-        <w:keepNext w:val="0"/>
         <w:spacing w:before="0" w:after="100" w:line="307" w:lineRule="auto"/>
         <w:ind w:firstLine="397"/>
       </w:pPr>
@@ -1069,7 +1062,6 @@
     <w:p>
       <w:pPr>
         <w:pStyle w:val="Normal"/>
-        <w:keepNext/>
         <w:spacing w:before="260" w:after="120" w:line="276" w:lineRule="auto"/>
       </w:pPr>
       <w:r>
@@ -1085,7 +1077,6 @@
     <w:p>
       <w:pPr>
         <w:pStyle w:val="Normal"/>
-        <w:keepNext/>
         <w:spacing w:before="180" w:after="120" w:line="276" w:lineRule="auto"/>
       </w:pPr>
       <w:r>
@@ -1100,7 +1091,6 @@
     </w:p>
     <w:p>
       <w:pPr>
-        <w:keepNext w:val="0"/>
         <w:spacing w:before="0" w:after="100" w:line="307" w:lineRule="auto"/>
         <w:ind w:firstLine="397"/>
       </w:pPr>
@@ -1161,7 +1151,6 @@
     </w:p>
     <w:p>
       <w:pPr>
-        <w:keepNext w:val="0"/>
         <w:spacing w:before="0" w:after="100" w:line="307" w:lineRule="auto"/>
         <w:ind w:firstLine="397"/>
       </w:pPr>
@@ -1178,7 +1167,6 @@
     <w:p>
       <w:pPr>
         <w:pStyle w:val="Normal"/>
-        <w:keepNext/>
         <w:spacing w:before="180" w:after="120" w:line="276" w:lineRule="auto"/>
       </w:pPr>
       <w:r>
@@ -1193,7 +1181,6 @@
     </w:p>
     <w:p>
       <w:pPr>
-        <w:keepNext w:val="0"/>
         <w:spacing w:before="0" w:after="100" w:line="307" w:lineRule="auto"/>
         <w:ind w:firstLine="397"/>
       </w:pPr>
@@ -1239,7 +1226,6 @@
     </w:p>
     <w:p>
       <w:pPr>
-        <w:keepNext w:val="0"/>
         <w:spacing w:before="0" w:after="100" w:line="307" w:lineRule="auto"/>
         <w:ind w:firstLine="397"/>
       </w:pPr>
@@ -1301,7 +1287,6 @@
     </w:tbl>
     <w:p>
       <w:pPr>
-        <w:keepNext w:val="0"/>
         <w:spacing w:before="0" w:after="0" w:line="307" w:lineRule="auto"/>
       </w:pPr>
       <w:r>
@@ -1315,7 +1300,6 @@
     </w:p>
     <w:p>
       <w:pPr>
-        <w:keepLines/>
         <w:spacing w:before="60" w:after="200"/>
         <w:jc w:val="center"/>
       </w:pPr>
@@ -1332,7 +1316,6 @@
     <w:p>
       <w:pPr>
         <w:pStyle w:val="Normal"/>
-        <w:keepNext/>
         <w:spacing w:before="180" w:after="120" w:line="276" w:lineRule="auto"/>
       </w:pPr>
       <w:r>
@@ -1347,7 +1330,6 @@
     </w:p>
     <w:p>
       <w:pPr>
-        <w:keepNext w:val="0"/>
         <w:spacing w:before="0" w:after="100" w:line="307" w:lineRule="auto"/>
         <w:ind w:firstLine="397"/>
       </w:pPr>
@@ -1363,7 +1345,6 @@
     </w:p>
     <w:p>
       <w:pPr>
-        <w:keepNext w:val="0"/>
         <w:spacing w:before="0" w:after="100" w:line="307" w:lineRule="auto"/>
         <w:ind w:firstLine="397"/>
       </w:pPr>
@@ -1379,7 +1360,6 @@
     </w:p>
     <w:p>
       <w:pPr>
-        <w:keepNext w:val="0"/>
         <w:spacing w:before="0" w:after="100" w:line="307" w:lineRule="auto"/>
         <w:ind w:firstLine="397"/>
       </w:pPr>
@@ -1441,7 +1421,6 @@
     <w:p>
       <w:pPr>
         <w:pStyle w:val="Normal"/>
-        <w:keepNext/>
         <w:spacing w:before="180" w:after="120" w:line="276" w:lineRule="auto"/>
       </w:pPr>
       <w:r>
@@ -1456,7 +1435,6 @@
     </w:p>
     <w:p>
       <w:pPr>
-        <w:keepNext w:val="0"/>
         <w:spacing w:before="0" w:after="100" w:line="307" w:lineRule="auto"/>
         <w:ind w:firstLine="397"/>
       </w:pPr>
@@ -1472,7 +1450,6 @@
     </w:p>
     <w:p>
       <w:pPr>
-        <w:keepNext/>
         <w:spacing w:before="120" w:after="0"/>
         <w:jc w:val="center"/>
       </w:pPr>
@@ -1513,7 +1490,6 @@
     </w:p>
     <w:p>
       <w:pPr>
-        <w:keepLines/>
         <w:spacing w:before="60" w:after="200"/>
         <w:jc w:val="center"/>
       </w:pPr>
@@ -1529,7 +1505,6 @@
     </w:p>
     <w:p>
       <w:pPr>
-        <w:keepNext/>
         <w:spacing w:before="120" w:after="0"/>
         <w:jc w:val="center"/>
       </w:pPr>
@@ -1570,7 +1545,6 @@
     </w:p>
     <w:p>
       <w:pPr>
-        <w:keepLines/>
         <w:spacing w:before="60" w:after="200"/>
         <w:jc w:val="center"/>
       </w:pPr>
@@ -1586,7 +1560,6 @@
     </w:p>
     <w:p>
       <w:pPr>
-        <w:keepNext/>
         <w:spacing w:before="120" w:after="0"/>
         <w:jc w:val="center"/>
       </w:pPr>
@@ -1627,7 +1600,6 @@
     </w:p>
     <w:p>
       <w:pPr>
-        <w:keepLines/>
         <w:spacing w:before="60" w:after="200"/>
         <w:jc w:val="center"/>
       </w:pPr>
@@ -1643,7 +1615,6 @@
     </w:p>
     <w:p>
       <w:pPr>
-        <w:keepNext/>
         <w:spacing w:before="120" w:after="0"/>
         <w:jc w:val="center"/>
       </w:pPr>
@@ -1684,7 +1655,6 @@
     </w:p>
     <w:p>
       <w:pPr>
-        <w:keepLines/>
         <w:spacing w:before="60" w:after="200"/>
         <w:jc w:val="center"/>
       </w:pPr>
@@ -1700,7 +1670,6 @@
     </w:p>
     <w:p>
       <w:pPr>
-        <w:keepNext/>
         <w:spacing w:before="120" w:after="0"/>
         <w:jc w:val="center"/>
       </w:pPr>
@@ -1741,7 +1710,6 @@
     </w:p>
     <w:p>
       <w:pPr>
-        <w:keepLines/>
         <w:spacing w:before="60" w:after="200"/>
         <w:jc w:val="center"/>
       </w:pPr>
@@ -1758,7 +1726,6 @@
     <w:p>
       <w:pPr>
         <w:pStyle w:val="Normal"/>
-        <w:keepNext/>
         <w:spacing w:before="180" w:after="120" w:line="276" w:lineRule="auto"/>
       </w:pPr>
       <w:r>
@@ -1773,7 +1740,6 @@
     </w:p>
     <w:p>
       <w:pPr>
-        <w:keepNext w:val="0"/>
         <w:spacing w:before="0" w:after="100" w:line="307" w:lineRule="auto"/>
         <w:ind w:firstLine="397"/>
       </w:pPr>
@@ -1804,7 +1770,6 @@
     </w:p>
     <w:p>
       <w:pPr>
-        <w:keepNext w:val="0"/>
         <w:spacing w:before="0" w:after="100" w:line="307" w:lineRule="auto"/>
         <w:ind w:firstLine="397"/>
       </w:pPr>
@@ -1820,7 +1785,6 @@
     </w:p>
     <w:p>
       <w:pPr>
-        <w:keepNext/>
         <w:spacing w:before="120" w:after="0"/>
         <w:jc w:val="center"/>
       </w:pPr>
@@ -1861,7 +1825,6 @@
     </w:p>
     <w:p>
       <w:pPr>
-        <w:keepLines/>
         <w:spacing w:before="60" w:after="200"/>
         <w:jc w:val="center"/>
       </w:pPr>
@@ -1877,7 +1840,6 @@
     </w:p>
     <w:p>
       <w:pPr>
-        <w:keepNext/>
         <w:spacing w:before="120" w:after="0"/>
         <w:jc w:val="center"/>
       </w:pPr>
@@ -1918,7 +1880,6 @@
     </w:p>
     <w:p>
       <w:pPr>
-        <w:keepLines/>
         <w:spacing w:before="60" w:after="200"/>
         <w:jc w:val="center"/>
       </w:pPr>
@@ -1935,7 +1896,6 @@
     <w:p>
       <w:pPr>
         <w:pStyle w:val="Normal"/>
-        <w:keepNext/>
         <w:spacing w:before="260" w:after="120" w:line="276" w:lineRule="auto"/>
       </w:pPr>
       <w:r>
@@ -1950,7 +1910,6 @@
     </w:p>
     <w:p>
       <w:pPr>
-        <w:keepNext w:val="0"/>
         <w:spacing w:before="0" w:after="100" w:line="307" w:lineRule="auto"/>
         <w:ind w:firstLine="397"/>
       </w:pPr>
@@ -1966,7 +1925,6 @@
     </w:p>
     <w:p>
       <w:pPr>
-        <w:keepNext w:val="0"/>
         <w:spacing w:before="0" w:after="100" w:line="307" w:lineRule="auto"/>
         <w:ind w:firstLine="397"/>
       </w:pPr>
@@ -2650,7 +2608,6 @@
   <w:style w:type="paragraph" w:styleId="Normal">
     <w:name w:val="Normal"/>
     <w:pPr>
-      <w:widowControl w:val="false"/>
       <w:bidi w:val="0"/>
       <w:jc w:val="both"/>
     </w:pPr>
@@ -2668,8 +2625,6 @@
     <w:basedOn w:val="Normal"/>
     <w:next w:val="Normal"/>
     <w:pPr>
-      <w:keepNext w:val="true"/>
-      <w:keepLines/>
       <w:numPr>
         <w:ilvl w:val="0"/>
         <w:numId w:val="2"/>
@@ -2696,8 +2651,6 @@
     <w:basedOn w:val="Normal"/>
     <w:next w:val="Normal"/>
     <w:pPr>
-      <w:keepNext w:val="true"/>
-      <w:keepLines/>
       <w:numPr>
         <w:ilvl w:val="0"/>
         <w:numId w:val="2"/>
@@ -2722,8 +2675,6 @@
     <w:basedOn w:val="Normal"/>
     <w:next w:val="Normal"/>
     <w:pPr>
-      <w:keepNext w:val="true"/>
-      <w:keepLines/>
       <w:numPr>
         <w:ilvl w:val="0"/>
         <w:numId w:val="2"/>
@@ -2747,8 +2698,6 @@
     <w:basedOn w:val="Normal"/>
     <w:next w:val="Normal"/>
     <w:pPr>
-      <w:keepNext w:val="true"/>
-      <w:keepLines/>
       <w:numPr>
         <w:ilvl w:val="0"/>
         <w:numId w:val="2"/>
@@ -2773,8 +2722,6 @@
     <w:basedOn w:val="Normal"/>
     <w:next w:val="Normal"/>
     <w:pPr>
-      <w:keepNext w:val="true"/>
-      <w:keepLines/>
       <w:numPr>
         <w:ilvl w:val="0"/>
         <w:numId w:val="2"/>
@@ -2798,8 +2745,6 @@
     <w:basedOn w:val="Normal"/>
     <w:next w:val="Normal"/>
     <w:pPr>
-      <w:keepNext w:val="true"/>
-      <w:keepLines/>
       <w:numPr>
         <w:ilvl w:val="0"/>
         <w:numId w:val="2"/>
@@ -2823,8 +2768,6 @@
     <w:basedOn w:val="Normal"/>
     <w:next w:val="Normal"/>
     <w:pPr>
-      <w:keepNext w:val="true"/>
-      <w:keepLines/>
       <w:numPr>
         <w:ilvl w:val="0"/>
         <w:numId w:val="2"/>
@@ -2847,8 +2790,6 @@
     <w:basedOn w:val="Normal"/>
     <w:next w:val="Normal"/>
     <w:pPr>
-      <w:keepNext w:val="true"/>
-      <w:keepLines/>
       <w:numPr>
         <w:ilvl w:val="0"/>
         <w:numId w:val="2"/>
@@ -2870,8 +2811,6 @@
     <w:basedOn w:val="Normal"/>
     <w:next w:val="Normal"/>
     <w:pPr>
-      <w:keepNext w:val="true"/>
-      <w:keepLines/>
       <w:numPr>
         <w:ilvl w:val="0"/>
         <w:numId w:val="2"/>
@@ -3036,9 +2975,7 @@
   <w:style w:type="paragraph" w:styleId="Style8">
     <w:name w:val="索引"/>
     <w:basedOn w:val="Normal"/>
-    <w:pPr>
-      <w:suppressLineNumbers/>
-    </w:pPr>
+    <w:pPr/>
     <w:rPr>
       <w:rFonts w:cs="Lucida Sans"/>
     </w:rPr>
@@ -3158,7 +3095,6 @@
     <w:name w:val="页眉与页脚"/>
     <w:basedOn w:val="Normal"/>
     <w:pPr>
-      <w:suppressLineNumbers/>
       <w:tabs>
         <w:tab w:val="clear" w:pos="420"/>
         <w:tab w:val="center" w:pos="4819" w:leader="none"/>
@@ -3291,7 +3227,6 @@
     <w:name w:val="普通(网站)"/>
     <w:basedOn w:val="Normal"/>
     <w:pPr>
-      <w:widowControl/>
       <w:spacing w:before="100" w:after="100"/>
       <w:jc w:val="start"/>
     </w:pPr>
@@ -3331,7 +3266,6 @@
     <w:name w:val="章标题(不加入目录内)"/>
     <w:basedOn w:val="Style7"/>
     <w:pPr>
-      <w:keepLines/>
       <w:spacing w:before="480" w:after="360"/>
       <w:outlineLvl w:val="9"/>
     </w:pPr>

</xml_diff>